<commit_message>
feat: Make resume current
</commit_message>
<xml_diff>
--- a/formats/ornl/resume.docx
+++ b/formats/ornl/resume.docx
@@ -11,13 +11,13 @@
         <w:t xml:space="preserve">KNOWLEDGE</w:t>
       </w:r>
     </w:p>
-    <w:bookmarkStart w:id="9" w:name="programming"/>
+    <w:bookmarkStart w:id="9" w:name="programming-technology"/>
     <w:p>
       <w:pPr>
         <w:pStyle w:val="Heading2"/>
       </w:pPr>
       <w:r>
-        <w:t xml:space="preserve">Programming</w:t>
+        <w:t xml:space="preserve">Programming / Technology</w:t>
       </w:r>
     </w:p>
     <w:p>
@@ -45,18 +45,18 @@
         <w:t xml:space="preserve"> </w:t>
       </w:r>
       <w:r>
+        <w:t xml:space="preserve">Python,</w:t>
+      </w:r>
+      <w:r>
+        <w:t xml:space="preserve"> </w:t>
+      </w:r>
+      <w:r>
         <w:t xml:space="preserve">PowerShell,</w:t>
       </w:r>
       <w:r>
         <w:t xml:space="preserve"> </w:t>
       </w:r>
       <w:r>
-        <w:t xml:space="preserve">Python,</w:t>
-      </w:r>
-      <w:r>
-        <w:t xml:space="preserve"> </w:t>
-      </w:r>
-      <w:r>
         <w:t xml:space="preserve">C#,</w:t>
       </w:r>
       <w:r>
@@ -81,7 +81,25 @@
         <w:t xml:space="preserve"> </w:t>
       </w:r>
       <w:r>
-        <w:t xml:space="preserve">HTML/XML/CSS</w:t>
+        <w:t xml:space="preserve">HTML/XML/CSS,</w:t>
+      </w:r>
+      <w:r>
+        <w:t xml:space="preserve"> </w:t>
+      </w:r>
+      <w:r>
+        <w:t xml:space="preserve">TypeSpec,</w:t>
+      </w:r>
+      <w:r>
+        <w:t xml:space="preserve"> </w:t>
+      </w:r>
+      <w:r>
+        <w:t xml:space="preserve">Docker,</w:t>
+      </w:r>
+      <w:r>
+        <w:t xml:space="preserve"> </w:t>
+      </w:r>
+      <w:r>
+        <w:t xml:space="preserve">Apptainer</w:t>
       </w:r>
     </w:p>
     <w:p>
@@ -145,12 +163,18 @@
         <w:t xml:space="preserve"> </w:t>
       </w:r>
       <w:r>
-        <w:t xml:space="preserve">R</w:t>
+        <w:t xml:space="preserve">R,</w:t>
+      </w:r>
+      <w:r>
+        <w:t xml:space="preserve"> </w:t>
+      </w:r>
+      <w:r>
+        <w:t xml:space="preserve">Kubernetes</w:t>
       </w:r>
     </w:p>
     <w:bookmarkEnd w:id="9"/>
     <w:bookmarkEnd w:id="10"/>
-    <w:bookmarkStart w:id="25" w:name="career-timeline"/>
+    <w:bookmarkStart w:id="35" w:name="career-timeline"/>
     <w:p>
       <w:pPr>
         <w:pStyle w:val="Heading1"/>
@@ -159,7 +183,7 @@
         <w:t xml:space="preserve">CAREER TIMELINE</w:t>
       </w:r>
     </w:p>
-    <w:bookmarkStart w:id="12" w:name="present-geospatial-data-scientist"/>
+    <w:bookmarkStart w:id="19" w:name="present-geospatial-data-scientist"/>
     <w:p>
       <w:pPr>
         <w:pStyle w:val="Heading2"/>
@@ -204,7 +228,21 @@
         </w:numPr>
       </w:pPr>
       <w:r>
-        <w:t xml:space="preserve">Work closely with senior R&amp;D professionals, providing impactful machine learning engineering and advanced analytical contributions to the conceptualization and design of new approaches that solve pressing national security challenges.</w:t>
+        <w:t xml:space="preserve">Lead development of</w:t>
+      </w:r>
+      <w:r>
+        <w:t xml:space="preserve"> </w:t>
+      </w:r>
+      <w:hyperlink r:id="rId12">
+        <w:r>
+          <w:rPr>
+            <w:rStyle w:val="Hyperlink"/>
+          </w:rPr>
+          <w:t xml:space="preserve">ACORN</w:t>
+        </w:r>
+      </w:hyperlink>
+      <w:r>
+        <w:t xml:space="preserve">, a Rust CLI metascience multitool that improves scientific practice through open, sustainable, and reproducible methods.</w:t>
       </w:r>
     </w:p>
     <w:p>
@@ -216,7 +254,7 @@
         </w:numPr>
       </w:pPr>
       <w:r>
-        <w:t xml:space="preserve">Provide coding support to implement new algorithms as proof of concept or prototype to test effectiveness and scalability of the proposed solutions.</w:t>
+        <w:t xml:space="preserve">Collaborate with senior R&amp;D staff to deliver ML engineering and advanced analytics for national security applications — from concept through production.</w:t>
       </w:r>
     </w:p>
     <w:p>
@@ -228,17 +266,184 @@
         </w:numPr>
       </w:pPr>
       <w:r>
-        <w:t xml:space="preserve">Work in a highly collaborative environment with data scientists, machine learning scientists, remote sensing scientists, engineers, physicists and geographers to deliver systems from prototyping to production level.</w:t>
-      </w:r>
-    </w:p>
-    <w:bookmarkEnd w:id="12"/>
-    <w:bookmarkStart w:id="15" w:name="X204475192f99ce84db03eca7c546a8dfddd91d5"/>
+        <w:t xml:space="preserve">Prototype and validate new algorithms, evaluating effectiveness and scalability before full deployment.</w:t>
+      </w:r>
+    </w:p>
+    <w:p>
+      <w:pPr>
+        <w:pStyle w:val="Compact"/>
+        <w:numPr>
+          <w:ilvl w:val="0"/>
+          <w:numId w:val="1002"/>
+        </w:numPr>
+      </w:pPr>
+      <w:r>
+        <w:t xml:space="preserve">Contribute geospatial visualization expertise to cross-disciplinary teams spanning data science, ML, remote sensing, physics, and geography; recognized</w:t>
+      </w:r>
+      <w:r>
+        <w:t xml:space="preserve"> </w:t>
+      </w:r>
+      <w:hyperlink r:id="rId13">
+        <w:r>
+          <w:rPr>
+            <w:rStyle w:val="Hyperlink"/>
+          </w:rPr>
+          <w:t xml:space="preserve">CesiumGS/cesium contributor</w:t>
+        </w:r>
+      </w:hyperlink>
+      <w:r>
+        <w:t xml:space="preserve">.</w:t>
+      </w:r>
+    </w:p>
+    <w:p>
+      <w:pPr>
+        <w:pStyle w:val="Compact"/>
+        <w:numPr>
+          <w:ilvl w:val="0"/>
+          <w:numId w:val="1002"/>
+        </w:numPr>
+      </w:pPr>
+      <w:r>
+        <w:t xml:space="preserve">Build and publish containerized environments using Docker and Apptainer.</w:t>
+      </w:r>
+    </w:p>
+    <w:p>
+      <w:pPr>
+        <w:pStyle w:val="Compact"/>
+        <w:numPr>
+          <w:ilvl w:val="0"/>
+          <w:numId w:val="1002"/>
+        </w:numPr>
+      </w:pPr>
+      <w:r>
+        <w:t xml:space="preserve">Architect automated data ingestion and processing pipelines; define API and data contracts using</w:t>
+      </w:r>
+      <w:r>
+        <w:t xml:space="preserve"> </w:t>
+      </w:r>
+      <w:hyperlink r:id="rId14">
+        <w:r>
+          <w:rPr>
+            <w:rStyle w:val="Hyperlink"/>
+          </w:rPr>
+          <w:t xml:space="preserve">TypeSpec</w:t>
+        </w:r>
+      </w:hyperlink>
+      <w:r>
+        <w:t xml:space="preserve"> </w:t>
+      </w:r>
+      <w:r>
+        <w:t xml:space="preserve">schemas (</w:t>
+      </w:r>
+      <w:hyperlink r:id="rId15">
+        <w:r>
+          <w:rPr>
+            <w:rStyle w:val="Hyperlink"/>
+          </w:rPr>
+          <w:t xml:space="preserve">purple</w:t>
+        </w:r>
+      </w:hyperlink>
+      <w:r>
+        <w:t xml:space="preserve">), and type-safe interfaces.</w:t>
+      </w:r>
+    </w:p>
+    <w:p>
+      <w:pPr>
+        <w:pStyle w:val="Compact"/>
+        <w:numPr>
+          <w:ilvl w:val="0"/>
+          <w:numId w:val="1002"/>
+        </w:numPr>
+      </w:pPr>
+      <w:r>
+        <w:t xml:space="preserve">Implement end-to-end MLOps workflows (similar to MLflow or DVC) for experiment tracking, model lifecycle management, and reproducible science.</w:t>
+      </w:r>
+    </w:p>
+    <w:p>
+      <w:pPr>
+        <w:pStyle w:val="Compact"/>
+        <w:numPr>
+          <w:ilvl w:val="0"/>
+          <w:numId w:val="1002"/>
+        </w:numPr>
+      </w:pPr>
+      <w:r>
+        <w:t xml:space="preserve">Manage the full scientific data lifecycle — ingestion to publication — using technology such as S3-compatible object storage and CKAN data catalogs.</w:t>
+      </w:r>
+    </w:p>
+    <w:p>
+      <w:pPr>
+        <w:pStyle w:val="Compact"/>
+        <w:numPr>
+          <w:ilvl w:val="0"/>
+          <w:numId w:val="1002"/>
+        </w:numPr>
+      </w:pPr>
+      <w:r>
+        <w:t xml:space="preserve">Enforce GitOps practices via GitHub Actions CI/CD with automated security scanning (Checkov, Hadolint, ShellCheck, etc.).</w:t>
+      </w:r>
+    </w:p>
+    <w:p>
+      <w:pPr>
+        <w:pStyle w:val="BlockText"/>
+      </w:pPr>
+      <w:r>
+        <w:t xml:space="preserve">Visit my</w:t>
+      </w:r>
+      <w:r>
+        <w:t xml:space="preserve"> </w:t>
+      </w:r>
+      <w:hyperlink r:id="rId16">
+        <w:r>
+          <w:rPr>
+            <w:rStyle w:val="Hyperlink"/>
+          </w:rPr>
+          <w:t xml:space="preserve">GitHub account</w:t>
+        </w:r>
+      </w:hyperlink>
+      <w:r>
+        <w:t xml:space="preserve"> </w:t>
+      </w:r>
+      <w:r>
+        <w:t xml:space="preserve">for examples — including</w:t>
+      </w:r>
+      <w:r>
+        <w:t xml:space="preserve"> </w:t>
+      </w:r>
+      <w:hyperlink r:id="rId17">
+        <w:r>
+          <w:rPr>
+            <w:rStyle w:val="Hyperlink"/>
+          </w:rPr>
+          <w:t xml:space="preserve">gold</w:t>
+        </w:r>
+      </w:hyperlink>
+      <w:r>
+        <w:t xml:space="preserve">, a containerized dev environment, and</w:t>
+      </w:r>
+      <w:r>
+        <w:t xml:space="preserve"> </w:t>
+      </w:r>
+      <w:hyperlink r:id="rId18">
+        <w:r>
+          <w:rPr>
+            <w:rStyle w:val="Hyperlink"/>
+          </w:rPr>
+          <w:t xml:space="preserve">pwsh-prelude</w:t>
+        </w:r>
+      </w:hyperlink>
+      <w:r>
+        <w:t xml:space="preserve">, a cross-platform PowerShell standard library (42 ⭐)</w:t>
+      </w:r>
+    </w:p>
+    <w:bookmarkEnd w:id="19"/>
+    <w:bookmarkStart w:id="22" w:name="X204475192f99ce84db03eca7c546a8dfddd91d5"/>
     <w:p>
       <w:pPr>
         <w:pStyle w:val="Heading2"/>
       </w:pPr>
       <w:r>
-        <w:t xml:space="preserve">03/20 – 04/22,</w:t>
+        <w:t xml:space="preserve">03/20 - 04/22,</w:t>
       </w:r>
       <w:r>
         <w:t xml:space="preserve"> </w:t>
@@ -257,7 +462,7 @@
       <w:pPr>
         <w:pStyle w:val="FirstParagraph"/>
       </w:pPr>
-      <w:hyperlink r:id="rId13">
+      <w:hyperlink r:id="rId20">
         <w:r>
           <w:rPr>
             <w:rStyle w:val="Hyperlink"/>
@@ -277,24 +482,24 @@
         </w:numPr>
       </w:pPr>
       <w:r>
-        <w:t xml:space="preserve">Contributor to the DoD</w:t>
-      </w:r>
-      <w:r>
-        <w:t xml:space="preserve"> </w:t>
-      </w:r>
-      <w:hyperlink r:id="rId14">
+        <w:t xml:space="preserve">Contributing author to the DoD</w:t>
+      </w:r>
+      <w:r>
+        <w:t xml:space="preserve"> </w:t>
+      </w:r>
+      <w:hyperlink r:id="rId21">
         <w:r>
           <w:rPr>
             <w:rStyle w:val="Hyperlink"/>
           </w:rPr>
-          <w:t xml:space="preserve">Artificial Intelligence Design Engineering for People and Technology (ADEPT)</w:t>
+          <w:t xml:space="preserve">ADEPT</w:t>
         </w:r>
       </w:hyperlink>
       <w:r>
         <w:t xml:space="preserve"> </w:t>
       </w:r>
       <w:r>
-        <w:t xml:space="preserve">framework.</w:t>
+        <w:t xml:space="preserve">(AI Design Engineering for People and Technology) framework.</w:t>
       </w:r>
     </w:p>
     <w:p>
@@ -306,7 +511,7 @@
         </w:numPr>
       </w:pPr>
       <w:r>
-        <w:t xml:space="preserve">Deputy team lead and Information System Security Manager (ISSM) for multi-million effort in support of national objectives</w:t>
+        <w:t xml:space="preserve">Deputy team lead and ISSM for a multi-million dollar national security program; accountable for information system security and compliance.</w:t>
       </w:r>
     </w:p>
     <w:p>
@@ -318,7 +523,7 @@
         </w:numPr>
       </w:pPr>
       <w:r>
-        <w:t xml:space="preserve">Artificial Intelligence and Machine Learning (AI/ML) subject matter expert for the Advanced Warfare Solutions branch</w:t>
+        <w:t xml:space="preserve">Served as AI/ML subject matter expert for the Advanced Warfare Solutions branch; advised senior leadership on emerging technologies and their operational implications.</w:t>
       </w:r>
     </w:p>
     <w:p>
@@ -330,7 +535,7 @@
         </w:numPr>
       </w:pPr>
       <w:r>
-        <w:t xml:space="preserve">Data scientist tasked with developing better understanding of operations with the goal improving mission effectiveness and efficiency.</w:t>
+        <w:t xml:space="preserve">Developed mathematical models and software tools using scientific methods to evaluate and predict mission support capabilities across multiple programs.</w:t>
       </w:r>
     </w:p>
     <w:p>
@@ -342,7 +547,7 @@
         </w:numPr>
       </w:pPr>
       <w:r>
-        <w:t xml:space="preserve">Advised leadership on emergent technologies (such as AI/ML) and methodologies.</w:t>
+        <w:t xml:space="preserve">Applied operations research techniques — including genetic algorithms for problems with no closed-form solution — to improve mission effectiveness and efficiency.</w:t>
       </w:r>
     </w:p>
     <w:p>
@@ -354,17 +559,60 @@
         </w:numPr>
       </w:pPr>
       <w:r>
-        <w:t xml:space="preserve">Utilized scientific inquiry in the independent development of mathematical models and computer programs to evaluate and predict the ability to support assigned projects, studies, or problems.</w:t>
-      </w:r>
-    </w:p>
-    <w:bookmarkEnd w:id="15"/>
-    <w:bookmarkStart w:id="17" w:name="principal-software-engineer"/>
+        <w:rPr>
+          <w:b/>
+          <w:bCs/>
+        </w:rPr>
+        <w:t xml:space="preserve">Network analysis</w:t>
+      </w:r>
+      <w:r>
+        <w:t xml:space="preserve"> </w:t>
+      </w:r>
+      <w:r>
+        <w:t xml:space="preserve">thesis (see</w:t>
+      </w:r>
+      <w:r>
+        <w:t xml:space="preserve"> </w:t>
+      </w:r>
+      <w:hyperlink w:anchor="publications-citations">
+        <w:r>
+          <w:rPr>
+            <w:rStyle w:val="Hyperlink"/>
+          </w:rPr>
+          <w:t xml:space="preserve">publications</w:t>
+        </w:r>
+      </w:hyperlink>
+      <w:r>
+        <w:t xml:space="preserve">) demonstrated applied graph theory at scale using real-world social network data.</w:t>
+      </w:r>
+    </w:p>
+    <w:p>
+      <w:pPr>
+        <w:pStyle w:val="Compact"/>
+        <w:numPr>
+          <w:ilvl w:val="0"/>
+          <w:numId w:val="1003"/>
+        </w:numPr>
+      </w:pPr>
+      <w:r>
+        <w:rPr>
+          <w:b/>
+          <w:bCs/>
+        </w:rPr>
+        <w:t xml:space="preserve">Owned security baseline</w:t>
+      </w:r>
+      <w:r>
+        <w:t xml:space="preserve">: monitored releases, reviewed changelogs, applied version updates, filed security impact reports, and trained teammates on modern tooling.</w:t>
+      </w:r>
+    </w:p>
+    <w:bookmarkEnd w:id="22"/>
+    <w:bookmarkStart w:id="27" w:name="principal-software-engineer"/>
     <w:p>
       <w:pPr>
         <w:pStyle w:val="Heading2"/>
       </w:pPr>
       <w:r>
-        <w:t xml:space="preserve">11/15 – 03/20,</w:t>
+        <w:t xml:space="preserve">11/15 - 03/20,</w:t>
       </w:r>
       <w:r>
         <w:t xml:space="preserve"> </w:t>
@@ -383,7 +631,7 @@
       <w:pPr>
         <w:pStyle w:val="FirstParagraph"/>
       </w:pPr>
-      <w:hyperlink r:id="rId16">
+      <w:hyperlink r:id="rId23">
         <w:r>
           <w:rPr>
             <w:rStyle w:val="Hyperlink"/>
@@ -403,7 +651,7 @@
         </w:numPr>
       </w:pPr>
       <w:r>
-        <w:t xml:space="preserve">Lead developer focused on quality and sustainability with experience configuring and using various continuous integration technologies</w:t>
+        <w:t xml:space="preserve">Lead developer for a multi-million dollar application; designed and owned front-end architecture, build pipeline, and CI/CD workflows.</w:t>
       </w:r>
     </w:p>
     <w:p>
@@ -415,7 +663,7 @@
         </w:numPr>
       </w:pPr>
       <w:r>
-        <w:t xml:space="preserve">Developed and implemented front-end architecture and workflow for multi-million dollar application</w:t>
+        <w:t xml:space="preserve">Cross-organization consultant and daily mentor; served as the team’s web technology authority on tooling, patterns, and best practices.</w:t>
       </w:r>
     </w:p>
     <w:p>
@@ -427,7 +675,24 @@
         </w:numPr>
       </w:pPr>
       <w:r>
-        <w:t xml:space="preserve">Served as web technology expert, experienced mentor, and valuable trainer</w:t>
+        <w:t xml:space="preserve">Authored</w:t>
+      </w:r>
+      <w:r>
+        <w:t xml:space="preserve"> </w:t>
+      </w:r>
+      <w:hyperlink r:id="rId24">
+        <w:r>
+          <w:rPr>
+            <w:rStyle w:val="Hyperlink"/>
+          </w:rPr>
+          <w:t xml:space="preserve">tomo-cli</w:t>
+        </w:r>
+      </w:hyperlink>
+      <w:r>
+        <w:t xml:space="preserve"> </w:t>
+      </w:r>
+      <w:r>
+        <w:t xml:space="preserve">— a Node.js CLI with a React-based terminal UI that scaffolds production-ready projects with React, Webpack, Parcel, ESLint, Jest, and Cesium.js.</w:t>
       </w:r>
     </w:p>
     <w:p>
@@ -439,17 +704,72 @@
         </w:numPr>
       </w:pPr>
       <w:r>
-        <w:t xml:space="preserve">Leveraged Agile practices such as scrums, sprints, extreme programming, and retrospectives.</w:t>
-      </w:r>
-    </w:p>
-    <w:bookmarkEnd w:id="17"/>
-    <w:bookmarkStart w:id="19" w:name="exercise-planner-readiness-coordinator"/>
+        <w:t xml:space="preserve">Built full-stack JavaScript applications and REST APIs with Express and Node.js; integrated automated testing, code coverage, and CI/CD from day one.</w:t>
+      </w:r>
+    </w:p>
+    <w:p>
+      <w:pPr>
+        <w:pStyle w:val="Compact"/>
+        <w:numPr>
+          <w:ilvl w:val="0"/>
+          <w:numId w:val="1004"/>
+        </w:numPr>
+      </w:pPr>
+      <w:r>
+        <w:t xml:space="preserve">Applied Agile practices (Scrum, sprints, XP, retrospectives) to deliver iterative,</w:t>
+      </w:r>
+      <w:r>
+        <w:t xml:space="preserve"> </w:t>
+      </w:r>
+      <w:hyperlink r:id="rId25">
+        <w:r>
+          <w:rPr>
+            <w:rStyle w:val="Hyperlink"/>
+          </w:rPr>
+          <w:t xml:space="preserve">sustainable software</w:t>
+        </w:r>
+      </w:hyperlink>
+      <w:r>
+        <w:t xml:space="preserve">.</w:t>
+      </w:r>
+    </w:p>
+    <w:p>
+      <w:pPr>
+        <w:pStyle w:val="Compact"/>
+        <w:numPr>
+          <w:ilvl w:val="0"/>
+          <w:numId w:val="1004"/>
+        </w:numPr>
+      </w:pPr>
+      <w:r>
+        <w:t xml:space="preserve">Delivered</w:t>
+      </w:r>
+      <w:r>
+        <w:t xml:space="preserve"> </w:t>
+      </w:r>
+      <w:hyperlink r:id="rId26">
+        <w:r>
+          <w:rPr>
+            <w:rStyle w:val="Hyperlink"/>
+          </w:rPr>
+          <w:t xml:space="preserve">numerous internal web technology presentations</w:t>
+        </w:r>
+      </w:hyperlink>
+      <w:r>
+        <w:t xml:space="preserve"> </w:t>
+      </w:r>
+      <w:r>
+        <w:t xml:space="preserve">to upskill teams across the organization.</w:t>
+      </w:r>
+    </w:p>
+    <w:bookmarkEnd w:id="27"/>
+    <w:bookmarkStart w:id="29" w:name="exercise-planner-readiness-coordinator"/>
     <w:p>
       <w:pPr>
         <w:pStyle w:val="Heading2"/>
       </w:pPr>
       <w:r>
-        <w:t xml:space="preserve">06/18 – 07/19,</w:t>
+        <w:t xml:space="preserve">06/18 - 07/19,</w:t>
       </w:r>
       <w:r>
         <w:t xml:space="preserve"> </w:t>
@@ -468,7 +788,7 @@
       <w:pPr>
         <w:pStyle w:val="FirstParagraph"/>
       </w:pPr>
-      <w:hyperlink r:id="rId18">
+      <w:hyperlink r:id="rId28">
         <w:r>
           <w:rPr>
             <w:rStyle w:val="Hyperlink"/>
@@ -488,7 +808,7 @@
         </w:numPr>
       </w:pPr>
       <w:r>
-        <w:t xml:space="preserve">Conduct planning and lead cross-functional teams to execute large scale exercises</w:t>
+        <w:t xml:space="preserve">Planned and led cross-functional teams executing large-scale joint exercises.</w:t>
       </w:r>
     </w:p>
     <w:p>
@@ -500,7 +820,7 @@
         </w:numPr>
       </w:pPr>
       <w:r>
-        <w:t xml:space="preserve">Coordinate command readiness and ensure assessments are timely and accurate</w:t>
+        <w:t xml:space="preserve">Tracked and reported command readiness; ensured assessments were timely, accurate, and actionable for leadership.</w:t>
       </w:r>
     </w:p>
     <w:p>
@@ -512,7 +832,7 @@
         </w:numPr>
       </w:pPr>
       <w:r>
-        <w:t xml:space="preserve">Develop and deliver command wide training on a weekly basis</w:t>
+        <w:t xml:space="preserve">Designed and delivered command-wide training weekly; served as Knowledge Management subject matter expert.</w:t>
       </w:r>
     </w:p>
     <w:p>
@@ -524,17 +844,17 @@
         </w:numPr>
       </w:pPr>
       <w:r>
-        <w:t xml:space="preserve">Knowledge Management subject matter expert</w:t>
-      </w:r>
-    </w:p>
-    <w:bookmarkEnd w:id="19"/>
-    <w:bookmarkStart w:id="21" w:name="senior-software-developer"/>
+        <w:t xml:space="preserve">Achieved 100% compliance with Navy SAPR training requirements; maintained 100% branch readiness as Training Officer.</w:t>
+      </w:r>
+    </w:p>
+    <w:bookmarkEnd w:id="29"/>
+    <w:bookmarkStart w:id="31" w:name="senior-software-developer"/>
     <w:p>
       <w:pPr>
         <w:pStyle w:val="Heading2"/>
       </w:pPr>
       <w:r>
-        <w:t xml:space="preserve">08/15 – 11/15,</w:t>
+        <w:t xml:space="preserve">08/15 - 11/15,</w:t>
       </w:r>
       <w:r>
         <w:t xml:space="preserve"> </w:t>
@@ -553,7 +873,7 @@
       <w:pPr>
         <w:pStyle w:val="FirstParagraph"/>
       </w:pPr>
-      <w:hyperlink r:id="rId20">
+      <w:hyperlink r:id="rId30">
         <w:r>
           <w:rPr>
             <w:rStyle w:val="Hyperlink"/>
@@ -576,14 +896,14 @@
         <w:t xml:space="preserve">Performed agile development using popular front-end technologies such as: Ampersand.js, Reveal.js, and Cesium.js</w:t>
       </w:r>
     </w:p>
-    <w:bookmarkEnd w:id="21"/>
-    <w:bookmarkStart w:id="22" w:name="senior-software-developer-1"/>
+    <w:bookmarkEnd w:id="31"/>
+    <w:bookmarkStart w:id="32" w:name="senior-software-developer-1"/>
     <w:p>
       <w:pPr>
         <w:pStyle w:val="Heading2"/>
       </w:pPr>
       <w:r>
-        <w:t xml:space="preserve">07/14 – 08/15,</w:t>
+        <w:t xml:space="preserve">07/14 - 08/15,</w:t>
       </w:r>
       <w:r>
         <w:t xml:space="preserve"> </w:t>
@@ -602,7 +922,7 @@
       <w:pPr>
         <w:pStyle w:val="FirstParagraph"/>
       </w:pPr>
-      <w:hyperlink r:id="rId16">
+      <w:hyperlink r:id="rId23">
         <w:r>
           <w:rPr>
             <w:rStyle w:val="Hyperlink"/>
@@ -637,14 +957,14 @@
         <w:t xml:space="preserve">Instrumental to implementing application infrastructure using MarionetteJS, HTML5, and Less.js</w:t>
       </w:r>
     </w:p>
-    <w:bookmarkEnd w:id="22"/>
-    <w:bookmarkStart w:id="23" w:name="strategic-plans-officer-security-manager"/>
+    <w:bookmarkEnd w:id="32"/>
+    <w:bookmarkStart w:id="33" w:name="strategic-plans-officer-security-manager"/>
     <w:p>
       <w:pPr>
         <w:pStyle w:val="Heading2"/>
       </w:pPr>
       <w:r>
-        <w:t xml:space="preserve">07/10 – 07/14,</w:t>
+        <w:t xml:space="preserve">07/10 - 07/14,</w:t>
       </w:r>
       <w:r>
         <w:t xml:space="preserve"> </w:t>
@@ -680,7 +1000,7 @@
         </w:numPr>
       </w:pPr>
       <w:r>
-        <w:t xml:space="preserve">Streamlined communication up chain of command and facilitated executive-level, biweekly planning meetings; improved planning process and enabled collaboration and senior leader strategic decision-making.</w:t>
+        <w:t xml:space="preserve">Facilitated executive-level biweekly planning meetings; streamlined command communication and enabled senior leader decision-making.</w:t>
       </w:r>
     </w:p>
     <w:p>
@@ -692,7 +1012,7 @@
         </w:numPr>
       </w:pPr>
       <w:r>
-        <w:t xml:space="preserve">Worked with and around multiple applications on a regular basis such as Global Strike Planning Aid (GSPA, now named ACME), Joint Targeting Toolbox (JTT), Digital Imagery Exploitation Engine (DIEE), SPA, and IMEA</w:t>
+        <w:t xml:space="preserve">Operated mission-critical targeting and imagery tools daily: GSPA/ACME, JTT, DIEE, SPA, and IMEA.</w:t>
       </w:r>
     </w:p>
     <w:p>
@@ -704,7 +1024,7 @@
         </w:numPr>
       </w:pPr>
       <w:r>
-        <w:t xml:space="preserve">Qualified as a Collateral Damage Estimate (CDE) analyst</w:t>
+        <w:t xml:space="preserve">Qualified Collateral Damage Estimate (CDE) analyst.</w:t>
       </w:r>
     </w:p>
     <w:p>
@@ -716,7 +1036,7 @@
         </w:numPr>
       </w:pPr>
       <w:r>
-        <w:t xml:space="preserve">Consulted with multiple groups in US Strategic Command; provided technical counsel on projects involving</w:t>
+        <w:t xml:space="preserve">Provided technical counsel on</w:t>
       </w:r>
       <w:r>
         <w:t xml:space="preserve"> </w:t>
@@ -749,7 +1069,10 @@
         <w:t xml:space="preserve">operations research</w:t>
       </w:r>
       <w:r>
-        <w:t xml:space="preserve">; improved products and furthered approval/development process.</w:t>
+        <w:t xml:space="preserve"> </w:t>
+      </w:r>
+      <w:r>
+        <w:t xml:space="preserve">to multiple USSTRATCOM groups; improved products and advanced the approval process.</w:t>
       </w:r>
     </w:p>
     <w:p>
@@ -761,17 +1084,33 @@
         </w:numPr>
       </w:pPr>
       <w:r>
-        <w:t xml:space="preserve">Modernized websites, maintained collaboration tools, created new tools for mission accomplishment, and maintained overall situational picture as division knowledge manager; improved productivity and efficiency.</w:t>
-      </w:r>
-    </w:p>
-    <w:bookmarkEnd w:id="23"/>
-    <w:bookmarkStart w:id="24" w:name="submarine-warfare-officer"/>
+        <w:t xml:space="preserve">Modernized the division’s web presence and knowledge management tools; designed a visual process grammar that directly contributed to the</w:t>
+      </w:r>
+      <w:r>
+        <w:t xml:space="preserve"> </w:t>
+      </w:r>
+      <w:r>
+        <w:rPr>
+          <w:b/>
+          <w:bCs/>
+        </w:rPr>
+        <w:t xml:space="preserve">data modernization</w:t>
+      </w:r>
+      <w:r>
+        <w:t xml:space="preserve"> </w:t>
+      </w:r>
+      <w:r>
+        <w:t xml:space="preserve">of the division and measurably improved productivity.</w:t>
+      </w:r>
+    </w:p>
+    <w:bookmarkEnd w:id="33"/>
+    <w:bookmarkStart w:id="34" w:name="submarine-warfare-officer"/>
     <w:p>
       <w:pPr>
         <w:pStyle w:val="Heading2"/>
       </w:pPr>
       <w:r>
-        <w:t xml:space="preserve">05/06 – 07/10,</w:t>
+        <w:t xml:space="preserve">05/06 - 07/10,</w:t>
       </w:r>
       <w:r>
         <w:t xml:space="preserve"> </w:t>
@@ -807,7 +1146,7 @@
         </w:numPr>
       </w:pPr>
       <w:r>
-        <w:t xml:space="preserve">Led team to verify 100% of damage control gear prior to sub’s major Operational Reactor Safeguard Exam; ensured zero deficiencies and sub’s ability to combat any casualty, real or simulated, during patrols.</w:t>
+        <w:t xml:space="preserve">Applied nuclear engineering training and submarine warfare qualifications daily — operating the engine room, standing watch, and leading the crew.</w:t>
       </w:r>
     </w:p>
     <w:p>
@@ -819,7 +1158,7 @@
         </w:numPr>
       </w:pPr>
       <w:r>
-        <w:t xml:space="preserve">Led efforts to improve tracking and control of top secret material; drafted and executed aggressive plan that successfully fixed sub’s wayward security program; led to no security-related discrepancies during inspection.</w:t>
+        <w:t xml:space="preserve">Achieved zero deficiencies on the Operational Reactor Safeguard Exam by leading 100% verification of all damage control gear.</w:t>
       </w:r>
     </w:p>
     <w:p>
@@ -831,27 +1170,42 @@
         </w:numPr>
       </w:pPr>
       <w:r>
-        <w:t xml:space="preserve">Selected out of 10 officers as sub’s inaugural LAN officer; essential in writing operating instructions; maintained LAN with 100% compliance and no major discrepancies during inspections.</w:t>
-      </w:r>
-    </w:p>
-    <w:bookmarkEnd w:id="24"/>
-    <w:bookmarkEnd w:id="25"/>
-    <w:bookmarkStart w:id="38" w:name="skills-experience"/>
+        <w:t xml:space="preserve">Overhauled the command’s classified material security program; drafted and executed a remediation plan that eliminated all security discrepancies at inspection.</w:t>
+      </w:r>
+    </w:p>
+    <w:p>
+      <w:pPr>
+        <w:pStyle w:val="Compact"/>
+        <w:numPr>
+          <w:ilvl w:val="0"/>
+          <w:numId w:val="1009"/>
+        </w:numPr>
+      </w:pPr>
+      <w:r>
+        <w:t xml:space="preserve">Selected from 10 officers as the submarine’s inaugural LAN officer; wrote operating instructions and maintained 100% compliance through inspections.</w:t>
+      </w:r>
+    </w:p>
+    <w:p>
+      <w:pPr>
+        <w:pStyle w:val="Compact"/>
+        <w:numPr>
+          <w:ilvl w:val="0"/>
+          <w:numId w:val="1009"/>
+        </w:numPr>
+      </w:pPr>
+      <w:r>
+        <w:t xml:space="preserve">Supervised nuclear reactor and engine room operations at sea and in port; led teams through complex technical procedures and casualty situations.</w:t>
+      </w:r>
+    </w:p>
+    <w:bookmarkEnd w:id="34"/>
+    <w:bookmarkEnd w:id="35"/>
+    <w:bookmarkStart w:id="37" w:name="education"/>
     <w:p>
       <w:pPr>
         <w:pStyle w:val="Heading1"/>
       </w:pPr>
       <w:r>
-        <w:t xml:space="preserve">SKILLS &amp; EXPERIENCE</w:t>
-      </w:r>
-    </w:p>
-    <w:bookmarkStart w:id="27" w:name="X2ebbb34eaace180d8c08291e33df9d32bbb6831"/>
-    <w:p>
-      <w:pPr>
-        <w:pStyle w:val="Heading2"/>
-      </w:pPr>
-      <w:r>
-        <w:t xml:space="preserve">Mathematics, Operations Research, &amp; Data Science</w:t>
+        <w:t xml:space="preserve">EDUCATION</w:t>
       </w:r>
     </w:p>
     <w:p>
@@ -862,50 +1216,18 @@
           <w:numId w:val="1010"/>
         </w:numPr>
       </w:pPr>
-      <w:r>
-        <w:t xml:space="preserve">During my Master’s studies, I studied Operations Research for over a year including the basics and a Python program to leverage genetic algorithms to solve a problem with no closed form solution.</w:t>
-      </w:r>
-    </w:p>
-    <w:p>
-      <w:pPr>
-        <w:pStyle w:val="Compact"/>
-        <w:numPr>
-          <w:ilvl w:val="0"/>
-          <w:numId w:val="1010"/>
-        </w:numPr>
-      </w:pPr>
-      <w:r>
-        <w:t xml:space="preserve">My Master’s thesis was an original topic of my own conception and</w:t>
-      </w:r>
-      <w:r>
-        <w:t xml:space="preserve"> </w:t>
-      </w:r>
       <w:r>
         <w:rPr>
           <w:b/>
           <w:bCs/>
         </w:rPr>
-        <w:t xml:space="preserve">leveraged network analysis</w:t>
-      </w:r>
-      <w:r>
-        <w:t xml:space="preserve"> </w:t>
-      </w:r>
-      <w:r>
-        <w:t xml:space="preserve">to analyze small world networks created from Facebook data. See</w:t>
-      </w:r>
-      <w:r>
-        <w:t xml:space="preserve"> </w:t>
-      </w:r>
-      <w:hyperlink w:anchor="publications-citations">
-        <w:r>
-          <w:rPr>
-            <w:rStyle w:val="Hyperlink"/>
-          </w:rPr>
-          <w:t xml:space="preserve">publications section</w:t>
-        </w:r>
-      </w:hyperlink>
-      <w:r>
-        <w:t xml:space="preserve">.</w:t>
+        <w:t xml:space="preserve">2021</w:t>
+      </w:r>
+      <w:r>
+        <w:t xml:space="preserve"> </w:t>
+      </w:r>
+      <w:r>
+        <w:t xml:space="preserve">Mini MBA, University of Nebraska at Omaha</w:t>
       </w:r>
     </w:p>
     <w:p>
@@ -916,397 +1238,20 @@
           <w:numId w:val="1010"/>
         </w:numPr>
       </w:pPr>
-      <w:r>
-        <w:t xml:space="preserve">As a developer, I have years of experience working with geospatial visualization technology. I am a</w:t>
-      </w:r>
-      <w:r>
-        <w:t xml:space="preserve"> </w:t>
-      </w:r>
-      <w:hyperlink r:id="rId26">
-        <w:r>
-          <w:rPr>
-            <w:rStyle w:val="Hyperlink"/>
-          </w:rPr>
-          <w:t xml:space="preserve">CesiumGS/cesium contributor</w:t>
-        </w:r>
-      </w:hyperlink>
-      <w:r>
-        <w:t xml:space="preserve">.</w:t>
-      </w:r>
-    </w:p>
-    <w:bookmarkEnd w:id="27"/>
-    <w:bookmarkStart w:id="32" w:name="Xc323c24b5658b3639a1cbecebc0cd50121ad340"/>
-    <w:p>
-      <w:pPr>
-        <w:pStyle w:val="Heading2"/>
-      </w:pPr>
-      <w:r>
-        <w:t xml:space="preserve">Design, DevSecOps, &amp; Robotic Process Automation (RPA)</w:t>
-      </w:r>
-    </w:p>
-    <w:p>
-      <w:pPr>
-        <w:pStyle w:val="Compact"/>
-        <w:numPr>
-          <w:ilvl w:val="0"/>
-          <w:numId w:val="1011"/>
-        </w:numPr>
-      </w:pPr>
-      <w:r>
-        <w:t xml:space="preserve">Team lead well versed in Agile methodologies and experienced with developing and deploying software via an iterative process focused on speed and</w:t>
-      </w:r>
-      <w:r>
-        <w:t xml:space="preserve"> </w:t>
-      </w:r>
-      <w:hyperlink r:id="rId28">
-        <w:r>
-          <w:rPr>
-            <w:rStyle w:val="Hyperlink"/>
-          </w:rPr>
-          <w:t xml:space="preserve">sustainability</w:t>
-        </w:r>
-      </w:hyperlink>
-      <w:r>
-        <w:t xml:space="preserve">.</w:t>
-      </w:r>
-    </w:p>
-    <w:p>
-      <w:pPr>
-        <w:pStyle w:val="Compact"/>
-        <w:numPr>
-          <w:ilvl w:val="0"/>
-          <w:numId w:val="1011"/>
-        </w:numPr>
-      </w:pPr>
-      <w:r>
-        <w:t xml:space="preserve">At USSTRATCOM, designed a visual grammar in order to create detailed process documentation. The documentation is intended to help</w:t>
-      </w:r>
-      <w:r>
-        <w:t xml:space="preserve"> </w:t>
-      </w:r>
       <w:r>
         <w:rPr>
           <w:b/>
           <w:bCs/>
         </w:rPr>
-        <w:t xml:space="preserve">architect sustainable solutions</w:t>
-      </w:r>
-      <w:r>
-        <w:t xml:space="preserve"> </w:t>
-      </w:r>
-      <w:r>
-        <w:t xml:space="preserve">in an effort to improve efficiency and mission readiness. Efforts directly contributed to</w:t>
-      </w:r>
-      <w:r>
-        <w:t xml:space="preserve"> </w:t>
-      </w:r>
-      <w:r>
-        <w:rPr>
-          <w:b/>
-          <w:bCs/>
-        </w:rPr>
-        <w:t xml:space="preserve">data modernization</w:t>
-      </w:r>
-      <w:r>
-        <w:t xml:space="preserve"> </w:t>
-      </w:r>
-      <w:r>
-        <w:t xml:space="preserve">of division.</w:t>
-      </w:r>
-    </w:p>
-    <w:p>
-      <w:pPr>
-        <w:pStyle w:val="Compact"/>
-        <w:numPr>
-          <w:ilvl w:val="0"/>
-          <w:numId w:val="1011"/>
-        </w:numPr>
-      </w:pPr>
-      <w:r>
-        <w:t xml:space="preserve">As a BAE Systems principal engineer, consulted on multiple projects across BAE Systems and mentored developers on a daily basis</w:t>
-      </w:r>
-    </w:p>
-    <w:p>
-      <w:pPr>
-        <w:pStyle w:val="Compact"/>
-        <w:numPr>
-          <w:ilvl w:val="0"/>
-          <w:numId w:val="1011"/>
-        </w:numPr>
-      </w:pPr>
-      <w:r>
-        <w:t xml:space="preserve">Created a</w:t>
-      </w:r>
-      <w:r>
-        <w:t xml:space="preserve"> </w:t>
-      </w:r>
-      <w:hyperlink r:id="rId29">
-        <w:r>
-          <w:rPr>
-            <w:rStyle w:val="Hyperlink"/>
-          </w:rPr>
-          <w:t xml:space="preserve">CLI tool to help create sustainable solutions with web technologies</w:t>
-        </w:r>
-      </w:hyperlink>
-      <w:r>
-        <w:t xml:space="preserve">. I maintain this project and leverage it to codify and share my knowledge in order to facilitate continued learning for me and others.</w:t>
-      </w:r>
-    </w:p>
-    <w:p>
-      <w:pPr>
-        <w:pStyle w:val="Compact"/>
-        <w:numPr>
-          <w:ilvl w:val="0"/>
-          <w:numId w:val="1011"/>
-        </w:numPr>
-      </w:pPr>
-      <w:r>
-        <w:rPr>
-          <w:b/>
-          <w:bCs/>
-        </w:rPr>
-        <w:t xml:space="preserve">Maintain security baseline</w:t>
-      </w:r>
-      <w:r>
-        <w:t xml:space="preserve"> </w:t>
-      </w:r>
-      <w:r>
-        <w:t xml:space="preserve">by monitoring releases, reviewing change logs, integrating version updates, submitting security impact reports, and training co-workers on modern trends and technologies.</w:t>
-      </w:r>
-    </w:p>
-    <w:p>
-      <w:pPr>
-        <w:pStyle w:val="Compact"/>
-        <w:numPr>
-          <w:ilvl w:val="0"/>
-          <w:numId w:val="1011"/>
-        </w:numPr>
-      </w:pPr>
-      <w:r>
-        <w:t xml:space="preserve">I regularly leverage software and services to implement RPA solutions for myriad task types like writing code and creating data visualizations.</w:t>
-      </w:r>
-    </w:p>
-    <w:p>
-      <w:pPr>
-        <w:pStyle w:val="BlockText"/>
-      </w:pPr>
-      <w:r>
-        <w:t xml:space="preserve">Visit my</w:t>
-      </w:r>
-      <w:r>
-        <w:t xml:space="preserve"> </w:t>
-      </w:r>
-      <w:hyperlink r:id="rId30">
-        <w:r>
-          <w:rPr>
-            <w:rStyle w:val="Hyperlink"/>
-          </w:rPr>
-          <w:t xml:space="preserve">GitHub account</w:t>
-        </w:r>
-      </w:hyperlink>
-      <w:r>
-        <w:t xml:space="preserve"> </w:t>
-      </w:r>
-      <w:r>
-        <w:t xml:space="preserve">for examples of my coding ability — like my PowerShell module,</w:t>
-      </w:r>
-      <w:r>
-        <w:t xml:space="preserve"> </w:t>
-      </w:r>
-      <w:hyperlink r:id="rId31">
-        <w:r>
-          <w:rPr>
-            <w:rStyle w:val="Hyperlink"/>
-          </w:rPr>
-          <w:t xml:space="preserve">Prelude</w:t>
-        </w:r>
-      </w:hyperlink>
-    </w:p>
-    <w:bookmarkEnd w:id="32"/>
-    <w:bookmarkStart w:id="36" w:name="training-mentorship"/>
-    <w:p>
-      <w:pPr>
-        <w:pStyle w:val="Heading2"/>
-      </w:pPr>
-      <w:r>
-        <w:t xml:space="preserve">Training &amp; Mentorship</w:t>
-      </w:r>
-    </w:p>
-    <w:p>
-      <w:pPr>
-        <w:pStyle w:val="Compact"/>
-        <w:numPr>
-          <w:ilvl w:val="0"/>
-          <w:numId w:val="1012"/>
-        </w:numPr>
-      </w:pPr>
-      <w:r>
-        <w:t xml:space="preserve">As a principal engineer at BAE Systems, developed and delivered</w:t>
-      </w:r>
-      <w:r>
-        <w:t xml:space="preserve"> </w:t>
-      </w:r>
-      <w:hyperlink r:id="rId33">
-        <w:r>
-          <w:rPr>
-            <w:rStyle w:val="Hyperlink"/>
-          </w:rPr>
-          <w:t xml:space="preserve">numerous presentations on web technology</w:t>
-        </w:r>
-      </w:hyperlink>
-    </w:p>
-    <w:p>
-      <w:pPr>
-        <w:pStyle w:val="Compact"/>
-        <w:numPr>
-          <w:ilvl w:val="0"/>
-          <w:numId w:val="1012"/>
-        </w:numPr>
-      </w:pPr>
-      <w:r>
-        <w:t xml:space="preserve">As a Command Training Team officer liaison, guided the planning and implementation of new training practices and procedures that included achieving 100% compliance with new Navy SAPR training guidance.</w:t>
-      </w:r>
-    </w:p>
-    <w:p>
-      <w:pPr>
-        <w:pStyle w:val="Compact"/>
-        <w:numPr>
-          <w:ilvl w:val="0"/>
-          <w:numId w:val="1012"/>
-        </w:numPr>
-      </w:pPr>
-      <w:r>
-        <w:t xml:space="preserve">Maintained 100% readiness as the branch Training Officer ensuring that personnel were always ready to meet mission objectives.</w:t>
-      </w:r>
-    </w:p>
-    <w:p>
-      <w:pPr>
-        <w:pStyle w:val="BlockText"/>
-      </w:pPr>
-      <w:r>
-        <w:t xml:space="preserve">Naturally, I use web technology to create my presentations (ex:</w:t>
-      </w:r>
-      <w:r>
-        <w:t xml:space="preserve"> </w:t>
-      </w:r>
-      <w:hyperlink r:id="rId34">
-        <w:r>
-          <w:rPr>
-            <w:rStyle w:val="Hyperlink"/>
-          </w:rPr>
-          <w:t xml:space="preserve">Reveal.js</w:t>
-        </w:r>
-      </w:hyperlink>
-      <w:r>
-        <w:t xml:space="preserve"> </w:t>
-      </w:r>
-      <w:r>
-        <w:t xml:space="preserve">and</w:t>
-      </w:r>
-      <w:r>
-        <w:t xml:space="preserve"> </w:t>
-      </w:r>
-      <w:hyperlink r:id="rId35">
-        <w:r>
-          <w:rPr>
-            <w:rStyle w:val="Hyperlink"/>
-          </w:rPr>
-          <w:t xml:space="preserve">Spectacle.js</w:t>
-        </w:r>
-      </w:hyperlink>
-      <w:r>
-        <w:t xml:space="preserve">)</w:t>
-      </w:r>
-    </w:p>
-    <w:bookmarkEnd w:id="36"/>
-    <w:bookmarkStart w:id="37" w:name="engineering-general-management"/>
-    <w:p>
-      <w:pPr>
-        <w:pStyle w:val="Heading2"/>
-      </w:pPr>
-      <w:r>
-        <w:t xml:space="preserve">Engineering &amp; General Management</w:t>
-      </w:r>
-    </w:p>
-    <w:p>
-      <w:pPr>
-        <w:pStyle w:val="Compact"/>
-        <w:numPr>
-          <w:ilvl w:val="0"/>
-          <w:numId w:val="1013"/>
-        </w:numPr>
-      </w:pPr>
-      <w:r>
-        <w:t xml:space="preserve">As a division officer on a submarine, supervised the daily operations of a nuclear reactor and engine room at sea and in port, maintaining electrical power to vital systems throughout the submarine.</w:t>
-      </w:r>
-    </w:p>
-    <w:p>
-      <w:pPr>
-        <w:pStyle w:val="Compact"/>
-        <w:numPr>
-          <w:ilvl w:val="0"/>
-          <w:numId w:val="1013"/>
-        </w:numPr>
-      </w:pPr>
-      <w:r>
-        <w:t xml:space="preserve">Led teams through complex technical procedures, during maintenance and casualty situations, maximizing efficiency while maintaining a safe environment.</w:t>
-      </w:r>
-    </w:p>
-    <w:bookmarkEnd w:id="37"/>
-    <w:bookmarkEnd w:id="38"/>
-    <w:bookmarkStart w:id="40" w:name="education"/>
-    <w:p>
-      <w:pPr>
-        <w:pStyle w:val="Heading1"/>
-      </w:pPr>
-      <w:r>
-        <w:t xml:space="preserve">EDUCATION</w:t>
-      </w:r>
-    </w:p>
-    <w:p>
-      <w:pPr>
-        <w:pStyle w:val="Compact"/>
-        <w:numPr>
-          <w:ilvl w:val="0"/>
-          <w:numId w:val="1014"/>
-        </w:numPr>
-      </w:pPr>
-      <w:r>
-        <w:rPr>
-          <w:b/>
-          <w:bCs/>
-        </w:rPr>
         <w:t xml:space="preserve">2021</w:t>
       </w:r>
       <w:r>
         <w:t xml:space="preserve"> </w:t>
       </w:r>
       <w:r>
-        <w:t xml:space="preserve">Mini MBA, University of Nebraska at Omaha</w:t>
-      </w:r>
-    </w:p>
-    <w:p>
-      <w:pPr>
-        <w:pStyle w:val="Compact"/>
-        <w:numPr>
-          <w:ilvl w:val="0"/>
-          <w:numId w:val="1014"/>
-        </w:numPr>
-      </w:pPr>
-      <w:r>
-        <w:rPr>
-          <w:b/>
-          <w:bCs/>
-        </w:rPr>
-        <w:t xml:space="preserve">2021</w:t>
-      </w:r>
-      <w:r>
-        <w:t xml:space="preserve"> </w:t>
-      </w:r>
-      <w:r>
         <w:t xml:space="preserve">Strategic Leadership Fellow, USSTRATCOM (</w:t>
       </w:r>
-      <w:hyperlink r:id="rId39">
+      <w:hyperlink r:id="rId36">
         <w:r>
           <w:rPr>
             <w:rStyle w:val="Hyperlink"/>
@@ -1323,7 +1268,7 @@
         <w:pStyle w:val="Compact"/>
         <w:numPr>
           <w:ilvl w:val="0"/>
-          <w:numId w:val="1014"/>
+          <w:numId w:val="1010"/>
         </w:numPr>
       </w:pPr>
       <w:r>
@@ -1345,7 +1290,7 @@
         <w:pStyle w:val="Compact"/>
         <w:numPr>
           <w:ilvl w:val="0"/>
-          <w:numId w:val="1014"/>
+          <w:numId w:val="1010"/>
         </w:numPr>
       </w:pPr>
       <w:r>
@@ -1367,7 +1312,7 @@
         <w:pStyle w:val="Compact"/>
         <w:numPr>
           <w:ilvl w:val="0"/>
-          <w:numId w:val="1014"/>
+          <w:numId w:val="1010"/>
         </w:numPr>
       </w:pPr>
       <w:r>
@@ -1384,8 +1329,8 @@
         <w:t xml:space="preserve">Bachelor of Arts, Physics, University of San Diego</w:t>
       </w:r>
     </w:p>
-    <w:bookmarkEnd w:id="40"/>
-    <w:bookmarkStart w:id="41" w:name="certifications"/>
+    <w:bookmarkEnd w:id="37"/>
+    <w:bookmarkStart w:id="38" w:name="certifications"/>
     <w:p>
       <w:pPr>
         <w:pStyle w:val="Heading1"/>
@@ -1399,7 +1344,7 @@
         <w:pStyle w:val="Compact"/>
         <w:numPr>
           <w:ilvl w:val="0"/>
-          <w:numId w:val="1015"/>
+          <w:numId w:val="1011"/>
         </w:numPr>
       </w:pPr>
       <w:r>
@@ -1421,7 +1366,7 @@
         <w:pStyle w:val="Compact"/>
         <w:numPr>
           <w:ilvl w:val="0"/>
-          <w:numId w:val="1015"/>
+          <w:numId w:val="1011"/>
         </w:numPr>
       </w:pPr>
       <w:r>
@@ -1438,8 +1383,8 @@
         <w:t xml:space="preserve">Professional in Human Resources (PHR)</w:t>
       </w:r>
     </w:p>
-    <w:bookmarkEnd w:id="41"/>
-    <w:bookmarkStart w:id="44" w:name="publications-citations"/>
+    <w:bookmarkEnd w:id="38"/>
+    <w:bookmarkStart w:id="41" w:name="publications-citations"/>
     <w:p>
       <w:pPr>
         <w:pStyle w:val="Heading1"/>
@@ -1450,13 +1395,21 @@
     </w:p>
     <w:p>
       <w:pPr>
-        <w:pStyle w:val="Compact"/>
-        <w:numPr>
-          <w:ilvl w:val="0"/>
-          <w:numId w:val="1016"/>
-        </w:numPr>
-      </w:pPr>
-      <w:hyperlink r:id="rId42">
+        <w:pStyle w:val="BlockText"/>
+      </w:pPr>
+      <w:r>
+        <w:t xml:space="preserve">See ORCiD profile for more</w:t>
+      </w:r>
+    </w:p>
+    <w:p>
+      <w:pPr>
+        <w:pStyle w:val="Compact"/>
+        <w:numPr>
+          <w:ilvl w:val="0"/>
+          <w:numId w:val="1012"/>
+        </w:numPr>
+      </w:pPr>
+      <w:hyperlink r:id="rId39">
         <w:r>
           <w:rPr>
             <w:rStyle w:val="Hyperlink"/>
@@ -1470,10 +1423,10 @@
         <w:pStyle w:val="Compact"/>
         <w:numPr>
           <w:ilvl w:val="0"/>
-          <w:numId w:val="1016"/>
-        </w:numPr>
-      </w:pPr>
-      <w:hyperlink r:id="rId43">
+          <w:numId w:val="1012"/>
+        </w:numPr>
+      </w:pPr>
+      <w:hyperlink r:id="rId40">
         <w:r>
           <w:rPr>
             <w:rStyle w:val="Hyperlink"/>
@@ -1482,8 +1435,8 @@
         </w:r>
       </w:hyperlink>
     </w:p>
-    <w:bookmarkEnd w:id="44"/>
-    <w:bookmarkStart w:id="45" w:name="professional-awards"/>
+    <w:bookmarkEnd w:id="41"/>
+    <w:bookmarkStart w:id="42" w:name="professional-awards"/>
     <w:p>
       <w:pPr>
         <w:pStyle w:val="Heading1"/>
@@ -1497,7 +1450,7 @@
         <w:pStyle w:val="Compact"/>
         <w:numPr>
           <w:ilvl w:val="0"/>
-          <w:numId w:val="1017"/>
+          <w:numId w:val="1013"/>
         </w:numPr>
       </w:pPr>
       <w:r>
@@ -1519,7 +1472,7 @@
         <w:pStyle w:val="Compact"/>
         <w:numPr>
           <w:ilvl w:val="0"/>
-          <w:numId w:val="1017"/>
+          <w:numId w:val="1013"/>
         </w:numPr>
       </w:pPr>
       <w:r>
@@ -1541,7 +1494,7 @@
         <w:pStyle w:val="Compact"/>
         <w:numPr>
           <w:ilvl w:val="0"/>
-          <w:numId w:val="1017"/>
+          <w:numId w:val="1013"/>
         </w:numPr>
       </w:pPr>
       <w:r>
@@ -1563,7 +1516,7 @@
         <w:pStyle w:val="Compact"/>
         <w:numPr>
           <w:ilvl w:val="0"/>
-          <w:numId w:val="1017"/>
+          <w:numId w:val="1013"/>
         </w:numPr>
       </w:pPr>
       <w:r>
@@ -1585,7 +1538,7 @@
         <w:pStyle w:val="Compact"/>
         <w:numPr>
           <w:ilvl w:val="0"/>
-          <w:numId w:val="1017"/>
+          <w:numId w:val="1013"/>
         </w:numPr>
       </w:pPr>
       <w:r>
@@ -1602,77 +1555,117 @@
         <w:t xml:space="preserve">Navy and Marine Corps Achievement</w:t>
       </w:r>
     </w:p>
-    <w:bookmarkEnd w:id="45"/>
-    <w:bookmarkStart w:id="46" w:name="other"/>
+    <w:bookmarkEnd w:id="42"/>
+    <w:bookmarkStart w:id="43" w:name="other-accomplishments"/>
     <w:p>
       <w:pPr>
         <w:pStyle w:val="Heading1"/>
       </w:pPr>
       <w:r>
-        <w:t xml:space="preserve">OTHER</w:t>
-      </w:r>
-    </w:p>
-    <w:p>
-      <w:pPr>
-        <w:pStyle w:val="Compact"/>
-        <w:numPr>
-          <w:ilvl w:val="0"/>
-          <w:numId w:val="1018"/>
-        </w:numPr>
-      </w:pPr>
-      <w:r>
-        <w:t xml:space="preserve">Cleared for Top Secret information and granted access to Sensitive Compartmented Information based on a Single Scope Background Investigation.</w:t>
-      </w:r>
-    </w:p>
-    <w:p>
-      <w:pPr>
-        <w:pStyle w:val="Compact"/>
-        <w:numPr>
-          <w:ilvl w:val="0"/>
-          <w:numId w:val="1018"/>
-        </w:numPr>
-      </w:pPr>
-      <w:r>
-        <w:t xml:space="preserve">2019 — Completed OSCP Penetration with Kali course. I did not pass the 24hr OSCP exam, but I learned a lot in the process.</w:t>
-      </w:r>
-    </w:p>
-    <w:p>
-      <w:pPr>
-        <w:pStyle w:val="Compact"/>
-        <w:numPr>
-          <w:ilvl w:val="0"/>
-          <w:numId w:val="1018"/>
-        </w:numPr>
-      </w:pPr>
-      <w:r>
-        <w:t xml:space="preserve">2014 — Present Navy Selected Ready Reserve member (Commander, O-5)</w:t>
-      </w:r>
-    </w:p>
-    <w:p>
-      <w:pPr>
-        <w:pStyle w:val="Compact"/>
-        <w:numPr>
-          <w:ilvl w:val="0"/>
-          <w:numId w:val="1018"/>
-        </w:numPr>
-      </w:pPr>
-      <w:r>
-        <w:t xml:space="preserve">2012 — 2013 Tutored online with tutor.com in Calculus and Algebra</w:t>
-      </w:r>
-    </w:p>
-    <w:p>
-      <w:pPr>
-        <w:pStyle w:val="Compact"/>
-        <w:numPr>
-          <w:ilvl w:val="0"/>
-          <w:numId w:val="1018"/>
-        </w:numPr>
-      </w:pPr>
-      <w:r>
-        <w:t xml:space="preserve">2011 — 2013 Tutored local high school students in Geometry and Trigonometry</w:t>
-      </w:r>
-    </w:p>
-    <w:bookmarkEnd w:id="46"/>
+        <w:t xml:space="preserve">OTHER ACCOMPLISHMENTS</w:t>
+      </w:r>
+    </w:p>
+    <w:p>
+      <w:pPr>
+        <w:pStyle w:val="Compact"/>
+        <w:numPr>
+          <w:ilvl w:val="0"/>
+          <w:numId w:val="1014"/>
+        </w:numPr>
+      </w:pPr>
+      <w:r>
+        <w:rPr>
+          <w:b/>
+          <w:bCs/>
+        </w:rPr>
+        <w:t xml:space="preserve">2026 - Present</w:t>
+      </w:r>
+      <w:r>
+        <w:t xml:space="preserve"> </w:t>
+      </w:r>
+      <w:r>
+        <w:t xml:space="preserve">Selected to lead Metadata and Technology working group for the inaugural US RAiD pilot</w:t>
+      </w:r>
+    </w:p>
+    <w:p>
+      <w:pPr>
+        <w:pStyle w:val="Compact"/>
+        <w:numPr>
+          <w:ilvl w:val="0"/>
+          <w:numId w:val="1014"/>
+        </w:numPr>
+      </w:pPr>
+      <w:r>
+        <w:rPr>
+          <w:b/>
+          <w:bCs/>
+        </w:rPr>
+        <w:t xml:space="preserve">2025 - Present</w:t>
+      </w:r>
+      <w:r>
+        <w:t xml:space="preserve"> </w:t>
+      </w:r>
+      <w:r>
+        <w:t xml:space="preserve">Inaugural steering committee member, Center for Open Science</w:t>
+      </w:r>
+    </w:p>
+    <w:p>
+      <w:pPr>
+        <w:pStyle w:val="Compact"/>
+        <w:numPr>
+          <w:ilvl w:val="0"/>
+          <w:numId w:val="1014"/>
+        </w:numPr>
+      </w:pPr>
+      <w:r>
+        <w:rPr>
+          <w:b/>
+          <w:bCs/>
+        </w:rPr>
+        <w:t xml:space="preserve">2019</w:t>
+      </w:r>
+      <w:r>
+        <w:t xml:space="preserve"> </w:t>
+      </w:r>
+      <w:r>
+        <w:t xml:space="preserve">Completed OSCP Penetration Testing with Kali Linux training</w:t>
+      </w:r>
+    </w:p>
+    <w:p>
+      <w:pPr>
+        <w:pStyle w:val="Compact"/>
+        <w:numPr>
+          <w:ilvl w:val="0"/>
+          <w:numId w:val="1014"/>
+        </w:numPr>
+      </w:pPr>
+      <w:r>
+        <w:rPr>
+          <w:b/>
+          <w:bCs/>
+        </w:rPr>
+        <w:t xml:space="preserve">2014 - Present</w:t>
+      </w:r>
+      <w:r>
+        <w:t xml:space="preserve"> </w:t>
+      </w:r>
+      <w:r>
+        <w:t xml:space="preserve">Navy Selected Ready Reserve (Commander, O-5)</w:t>
+      </w:r>
+    </w:p>
+    <w:p>
+      <w:pPr>
+        <w:pStyle w:val="Compact"/>
+        <w:numPr>
+          <w:ilvl w:val="0"/>
+          <w:numId w:val="1014"/>
+        </w:numPr>
+      </w:pPr>
+      <w:r>
+        <w:t xml:space="preserve">Holds Top Secret / SCI clearance based on Single Scope Background Investigation</w:t>
+      </w:r>
+    </w:p>
+    <w:bookmarkEnd w:id="43"/>
     <w:sectPr>
       <w:footnotePr>
         <w:numRestart w:val="eachSect"/>
@@ -1929,18 +1922,6 @@
     <w:abstractNumId w:val="991"/>
   </w:num>
   <w:num w:numId="1014">
-    <w:abstractNumId w:val="991"/>
-  </w:num>
-  <w:num w:numId="1015">
-    <w:abstractNumId w:val="991"/>
-  </w:num>
-  <w:num w:numId="1016">
-    <w:abstractNumId w:val="991"/>
-  </w:num>
-  <w:num w:numId="1017">
-    <w:abstractNumId w:val="991"/>
-  </w:num>
-  <w:num w:numId="1018">
     <w:abstractNumId w:val="991"/>
   </w:num>
 </w:numbering>

</xml_diff>

<commit_message>
fix: Remove problematic character; remove old artifacts; generate new PDF
</commit_message>
<xml_diff>
--- a/formats/ornl/resume.docx
+++ b/formats/ornl/resume.docx
@@ -316,7 +316,7 @@
         </w:numPr>
       </w:pPr>
       <w:r>
-        <w:t xml:space="preserve">Architect automated data ingestion and processing pipelines; define API and data contracts using</w:t>
+        <w:t xml:space="preserve">Architect automated data ingestion and processing pipelines; define API and data contracts using DSLs such as</w:t>
       </w:r>
       <w:r>
         <w:t xml:space="preserve"> </w:t>
@@ -330,10 +330,7 @@
         </w:r>
       </w:hyperlink>
       <w:r>
-        <w:t xml:space="preserve"> </w:t>
-      </w:r>
-      <w:r>
-        <w:t xml:space="preserve">schemas (</w:t>
+        <w:t xml:space="preserve">, schemas (</w:t>
       </w:r>
       <w:hyperlink r:id="rId15">
         <w:r>
@@ -344,7 +341,7 @@
         </w:r>
       </w:hyperlink>
       <w:r>
-        <w:t xml:space="preserve">), and type-safe interfaces.</w:t>
+        <w:t xml:space="preserve">), and type-safe data models.</w:t>
       </w:r>
     </w:p>
     <w:p>
@@ -433,7 +430,7 @@
         </w:r>
       </w:hyperlink>
       <w:r>
-        <w:t xml:space="preserve">, a cross-platform PowerShell standard library (42 ⭐)</w:t>
+        <w:t xml:space="preserve">, a cross-platform PowerShell standard library (42 stars)</w:t>
       </w:r>
     </w:p>
     <w:bookmarkEnd w:id="19"/>

</xml_diff>

<commit_message>
feat: Address changes from input
</commit_message>
<xml_diff>
--- a/formats/ornl/resume.docx
+++ b/formats/ornl/resume.docx
@@ -556,50 +556,7 @@
         </w:numPr>
       </w:pPr>
       <w:r>
-        <w:rPr>
-          <w:b/>
-          <w:bCs/>
-        </w:rPr>
-        <w:t xml:space="preserve">Network analysis</w:t>
-      </w:r>
-      <w:r>
-        <w:t xml:space="preserve"> </w:t>
-      </w:r>
-      <w:r>
-        <w:t xml:space="preserve">thesis (see</w:t>
-      </w:r>
-      <w:r>
-        <w:t xml:space="preserve"> </w:t>
-      </w:r>
-      <w:hyperlink w:anchor="publications-citations">
-        <w:r>
-          <w:rPr>
-            <w:rStyle w:val="Hyperlink"/>
-          </w:rPr>
-          <w:t xml:space="preserve">publications</w:t>
-        </w:r>
-      </w:hyperlink>
-      <w:r>
-        <w:t xml:space="preserve">) demonstrated applied graph theory at scale using real-world social network data.</w:t>
-      </w:r>
-    </w:p>
-    <w:p>
-      <w:pPr>
-        <w:pStyle w:val="Compact"/>
-        <w:numPr>
-          <w:ilvl w:val="0"/>
-          <w:numId w:val="1003"/>
-        </w:numPr>
-      </w:pPr>
-      <w:r>
-        <w:rPr>
-          <w:b/>
-          <w:bCs/>
-        </w:rPr>
-        <w:t xml:space="preserve">Owned security baseline</w:t>
-      </w:r>
-      <w:r>
-        <w:t xml:space="preserve">: monitored releases, reviewed changelogs, applied version updates, filed security impact reports, and trained teammates on modern tooling.</w:t>
+        <w:t xml:space="preserve">Owned security baseline — monitored releases, reviewed changelogs, applied version updates, filed security impact reports, and trained teammates on modern tooling.</w:t>
       </w:r>
     </w:p>
     <w:bookmarkEnd w:id="22"/>
@@ -795,6 +752,12 @@
           <w:t xml:space="preserve">CJTFHOA</w:t>
         </w:r>
       </w:hyperlink>
+      <w:r>
+        <w:t xml:space="preserve"> </w:t>
+      </w:r>
+      <w:r>
+        <w:t xml:space="preserve">(Mobilized to Djibouti in support of Operation Noble Eagle)</w:t>
+      </w:r>
     </w:p>
     <w:p>
       <w:pPr>
@@ -1440,6 +1403,50 @@
       </w:pPr>
       <w:r>
         <w:t xml:space="preserve">PROFESSIONAL AWARDS</w:t>
+      </w:r>
+    </w:p>
+    <w:p>
+      <w:pPr>
+        <w:pStyle w:val="Compact"/>
+        <w:numPr>
+          <w:ilvl w:val="0"/>
+          <w:numId w:val="1013"/>
+        </w:numPr>
+      </w:pPr>
+      <w:r>
+        <w:rPr>
+          <w:b/>
+          <w:bCs/>
+        </w:rPr>
+        <w:t xml:space="preserve">2025</w:t>
+      </w:r>
+      <w:r>
+        <w:t xml:space="preserve"> </w:t>
+      </w:r>
+      <w:r>
+        <w:t xml:space="preserve">Best workshop award (ORNL Data Expo 2025)</w:t>
+      </w:r>
+    </w:p>
+    <w:p>
+      <w:pPr>
+        <w:pStyle w:val="Compact"/>
+        <w:numPr>
+          <w:ilvl w:val="0"/>
+          <w:numId w:val="1013"/>
+        </w:numPr>
+      </w:pPr>
+      <w:r>
+        <w:rPr>
+          <w:b/>
+          <w:bCs/>
+        </w:rPr>
+        <w:t xml:space="preserve">2024</w:t>
+      </w:r>
+      <w:r>
+        <w:t xml:space="preserve"> </w:t>
+      </w:r>
+      <w:r>
+        <w:t xml:space="preserve">ORNL Community Outreach Award</w:t>
       </w:r>
     </w:p>
     <w:p>

</xml_diff>